<commit_message>
Staff: offer letter fits one page (two-column key-terms box)
Reworked the modernised offer letter so it sits on a single page: the
headline terms (role, reporting-to, pay, start date, hours) now render
as a borderless two-column "key terms" box instead of a stacked bullet
list, plus slightly tighter margins. Rendered via LibreOffice and
confirmed: 1 page, all fields fill, employer resolves to MAUKBs Ltd,
navy+bold values and red signing X intact.

Co-Authored-By: Claude Opus 4.8 <noreply@anthropic.com>
</commit_message>
<xml_diff>
--- a/doc_templates/template_Offer_Letter_v3.docx
+++ b/doc_templates/template_Offer_Letter_v3.docx
@@ -222,131 +222,174 @@
         <w:t>Your headline terms are:</w:t>
       </w:r>
     </w:p>
-    <w:p>
-      <w:pPr>
-        <w:pStyle w:val="ListBullet"/>
-        <w:spacing w:after="40"/>
-      </w:pPr>
-      <w:r>
-        <w:rPr>
-          <w:rFonts w:ascii="Calibri" w:hAnsi="Calibri"/>
-          <w:b/>
-          <w:sz w:val="22"/>
-        </w:rPr>
-        <w:t xml:space="preserve">Role: </w:t>
-      </w:r>
-      <w:r>
-        <w:rPr>
-          <w:rFonts w:ascii="Calibri" w:hAnsi="Calibri"/>
-          <w:color w:val="C00000"/>
-          <w:sz w:val="22"/>
-        </w:rPr>
-        <w:t>&lt;&lt;FT or PT&gt;&gt;</w:t>
-      </w:r>
-      <w:r>
-        <w:rPr>
-          <w:rFonts w:ascii="Calibri" w:hAnsi="Calibri"/>
-          <w:sz w:val="22"/>
-        </w:rPr>
-        <w:t xml:space="preserve"> </w:t>
-      </w:r>
-      <w:r>
-        <w:rPr>
-          <w:rFonts w:ascii="Calibri" w:hAnsi="Calibri"/>
-          <w:color w:val="C00000"/>
-          <w:sz w:val="22"/>
-        </w:rPr>
-        <w:t>&lt;&lt;Position&gt;&gt;</w:t>
-      </w:r>
-    </w:p>
-    <w:p>
-      <w:pPr>
-        <w:pStyle w:val="ListBullet"/>
-        <w:spacing w:after="40"/>
-      </w:pPr>
-      <w:r>
-        <w:rPr>
-          <w:rFonts w:ascii="Calibri" w:hAnsi="Calibri"/>
-          <w:b/>
-          <w:sz w:val="22"/>
-        </w:rPr>
-        <w:t xml:space="preserve">Reporting to: </w:t>
-      </w:r>
-      <w:r>
-        <w:rPr>
-          <w:rFonts w:ascii="Calibri" w:hAnsi="Calibri"/>
-          <w:color w:val="C00000"/>
-          <w:sz w:val="22"/>
-        </w:rPr>
-        <w:t>&lt;&lt;reporting to&gt;&gt;</w:t>
-      </w:r>
-    </w:p>
-    <w:p>
-      <w:pPr>
-        <w:pStyle w:val="ListBullet"/>
-        <w:spacing w:after="40"/>
-      </w:pPr>
-      <w:r>
-        <w:rPr>
-          <w:rFonts w:ascii="Calibri" w:hAnsi="Calibri"/>
-          <w:b/>
-          <w:sz w:val="22"/>
-        </w:rPr>
-        <w:t xml:space="preserve">Pay: </w:t>
-      </w:r>
-      <w:r>
-        <w:rPr>
-          <w:rFonts w:ascii="Calibri" w:hAnsi="Calibri"/>
-          <w:color w:val="C00000"/>
-          <w:sz w:val="22"/>
-        </w:rPr>
-        <w:t>&lt;&lt;wages&gt;&gt;</w:t>
-      </w:r>
-    </w:p>
-    <w:p>
-      <w:pPr>
-        <w:pStyle w:val="ListBullet"/>
-        <w:spacing w:after="40"/>
-      </w:pPr>
-      <w:r>
-        <w:rPr>
-          <w:rFonts w:ascii="Calibri" w:hAnsi="Calibri"/>
-          <w:b/>
-          <w:sz w:val="22"/>
-        </w:rPr>
-        <w:t xml:space="preserve">Start date: </w:t>
-      </w:r>
-      <w:r>
-        <w:rPr>
-          <w:rFonts w:ascii="Calibri" w:hAnsi="Calibri"/>
-          <w:color w:val="C00000"/>
-          <w:sz w:val="22"/>
-        </w:rPr>
-        <w:t>&lt;&lt;date of joining&gt;&gt;</w:t>
-      </w:r>
-    </w:p>
-    <w:p>
-      <w:pPr>
-        <w:pStyle w:val="ListBullet"/>
-        <w:spacing w:after="40"/>
-      </w:pPr>
-      <w:r>
-        <w:rPr>
-          <w:rFonts w:ascii="Calibri" w:hAnsi="Calibri"/>
-          <w:b/>
-          <w:sz w:val="22"/>
-        </w:rPr>
-        <w:t xml:space="preserve">Hours: </w:t>
-      </w:r>
-      <w:r>
-        <w:rPr>
-          <w:rFonts w:ascii="Calibri" w:hAnsi="Calibri"/>
-          <w:color w:val="C00000"/>
-          <w:sz w:val="22"/>
-        </w:rPr>
-        <w:t>&lt;&lt;contracted hours&gt;&gt;</w:t>
-      </w:r>
-    </w:p>
+    <w:tbl>
+      <w:tblPr>
+        <w:tblW w:type="auto" w:w="0"/>
+        <w:tblLayout w:type="fixed"/>
+        <w:tblLook w:firstColumn="1" w:firstRow="1" w:lastColumn="0" w:lastRow="0" w:noHBand="0" w:noVBand="1" w:val="04A0"/>
+      </w:tblPr>
+      <w:tblGrid>
+        <w:gridCol w:w="4824"/>
+        <w:gridCol w:w="4824"/>
+      </w:tblGrid>
+      <w:tr>
+        <w:tc>
+          <w:tcPr>
+            <w:tcW w:type="dxa" w:w="4824"/>
+          </w:tcPr>
+          <w:p>
+            <w:pPr>
+              <w:spacing w:after="60"/>
+            </w:pPr>
+            <w:r>
+              <w:rPr>
+                <w:rFonts w:ascii="Calibri" w:hAnsi="Calibri"/>
+                <w:b/>
+                <w:sz w:val="22"/>
+              </w:rPr>
+              <w:t xml:space="preserve">Role: </w:t>
+            </w:r>
+            <w:r>
+              <w:rPr>
+                <w:rFonts w:ascii="Calibri" w:hAnsi="Calibri"/>
+                <w:color w:val="C00000"/>
+                <w:sz w:val="22"/>
+              </w:rPr>
+              <w:t>&lt;&lt;FT or PT&gt;&gt;</w:t>
+            </w:r>
+            <w:r>
+              <w:rPr>
+                <w:rFonts w:ascii="Calibri" w:hAnsi="Calibri"/>
+                <w:sz w:val="22"/>
+              </w:rPr>
+              <w:t xml:space="preserve"> </w:t>
+            </w:r>
+            <w:r>
+              <w:rPr>
+                <w:rFonts w:ascii="Calibri" w:hAnsi="Calibri"/>
+                <w:color w:val="C00000"/>
+                <w:sz w:val="22"/>
+              </w:rPr>
+              <w:t>&lt;&lt;Position&gt;&gt;</w:t>
+            </w:r>
+          </w:p>
+        </w:tc>
+        <w:tc>
+          <w:tcPr>
+            <w:tcW w:type="dxa" w:w="4824"/>
+          </w:tcPr>
+          <w:p>
+            <w:pPr>
+              <w:spacing w:after="60"/>
+            </w:pPr>
+            <w:r>
+              <w:rPr>
+                <w:rFonts w:ascii="Calibri" w:hAnsi="Calibri"/>
+                <w:b/>
+                <w:sz w:val="22"/>
+              </w:rPr>
+              <w:t xml:space="preserve">Pay: </w:t>
+            </w:r>
+            <w:r>
+              <w:rPr>
+                <w:rFonts w:ascii="Calibri" w:hAnsi="Calibri"/>
+                <w:color w:val="C00000"/>
+                <w:sz w:val="22"/>
+              </w:rPr>
+              <w:t>&lt;&lt;wages&gt;&gt;</w:t>
+            </w:r>
+          </w:p>
+        </w:tc>
+      </w:tr>
+      <w:tr>
+        <w:tc>
+          <w:tcPr>
+            <w:tcW w:type="dxa" w:w="4824"/>
+          </w:tcPr>
+          <w:p>
+            <w:pPr>
+              <w:spacing w:after="60"/>
+            </w:pPr>
+            <w:r>
+              <w:rPr>
+                <w:rFonts w:ascii="Calibri" w:hAnsi="Calibri"/>
+                <w:b/>
+                <w:sz w:val="22"/>
+              </w:rPr>
+              <w:t xml:space="preserve">Reporting to: </w:t>
+            </w:r>
+            <w:r>
+              <w:rPr>
+                <w:rFonts w:ascii="Calibri" w:hAnsi="Calibri"/>
+                <w:color w:val="C00000"/>
+                <w:sz w:val="22"/>
+              </w:rPr>
+              <w:t>&lt;&lt;reporting to&gt;&gt;</w:t>
+            </w:r>
+          </w:p>
+        </w:tc>
+        <w:tc>
+          <w:tcPr>
+            <w:tcW w:type="dxa" w:w="4824"/>
+          </w:tcPr>
+          <w:p>
+            <w:pPr>
+              <w:spacing w:after="60"/>
+            </w:pPr>
+            <w:r>
+              <w:rPr>
+                <w:rFonts w:ascii="Calibri" w:hAnsi="Calibri"/>
+                <w:b/>
+                <w:sz w:val="22"/>
+              </w:rPr>
+              <w:t xml:space="preserve">Hours: </w:t>
+            </w:r>
+            <w:r>
+              <w:rPr>
+                <w:rFonts w:ascii="Calibri" w:hAnsi="Calibri"/>
+                <w:color w:val="C00000"/>
+                <w:sz w:val="22"/>
+              </w:rPr>
+              <w:t>&lt;&lt;contracted hours&gt;&gt;</w:t>
+            </w:r>
+          </w:p>
+        </w:tc>
+      </w:tr>
+      <w:tr>
+        <w:tc>
+          <w:tcPr>
+            <w:tcW w:type="dxa" w:w="4824"/>
+          </w:tcPr>
+          <w:p>
+            <w:pPr>
+              <w:spacing w:after="60"/>
+            </w:pPr>
+            <w:r>
+              <w:rPr>
+                <w:rFonts w:ascii="Calibri" w:hAnsi="Calibri"/>
+                <w:b/>
+                <w:sz w:val="22"/>
+              </w:rPr>
+              <w:t xml:space="preserve">Start date: </w:t>
+            </w:r>
+            <w:r>
+              <w:rPr>
+                <w:rFonts w:ascii="Calibri" w:hAnsi="Calibri"/>
+                <w:color w:val="C00000"/>
+                <w:sz w:val="22"/>
+              </w:rPr>
+              <w:t>&lt;&lt;date of joining&gt;&gt;</w:t>
+            </w:r>
+          </w:p>
+        </w:tc>
+        <w:tc>
+          <w:tcPr>
+            <w:tcW w:type="dxa" w:w="4824"/>
+          </w:tcPr>
+          <w:p/>
+        </w:tc>
+      </w:tr>
+    </w:tbl>
     <w:p>
       <w:pPr>
         <w:spacing w:after="80"/>
@@ -501,7 +544,7 @@
     </w:p>
     <w:sectPr>
       <w:pgSz w:w="12240" w:h="15840"/>
-      <w:pgMar w:top="1440" w:right="1800" w:bottom="1440" w:left="1800" w:header="720" w:footer="720" w:gutter="0"/>
+      <w:pgMar w:top="1008" w:right="1296" w:bottom="864" w:left="1296" w:header="720" w:footer="720" w:gutter="0"/>
       <w:cols w:space="720"/>
       <w:docGrid w:linePitch="360"/>
     </w:sectPr>

</xml_diff>